<commit_message>
Speech completo: historia + parte final con bienvenida de Lucía y Claudia fuera del rol play
Co-Authored-By: Claude Sonnet 5.5 <noreply@anthropic.com>
</commit_message>
<xml_diff>
--- a/docs/Speech_presentacion.docx
+++ b/docs/Speech_presentacion.docx
@@ -3,7 +3,17 @@
 <w:document xmlns:wpc="http://schemas.microsoft.com/office/word/2010/wordprocessingCanvas" xmlns:cx="http://schemas.microsoft.com/office/drawing/2014/chartex" xmlns:cx1="http://schemas.microsoft.com/office/drawing/2015/9/8/chartex" xmlns:cx2="http://schemas.microsoft.com/office/drawing/2015/10/21/chartex" xmlns:cx3="http://schemas.microsoft.com/office/drawing/2016/5/9/chartex" xmlns:cx4="http://schemas.microsoft.com/office/drawing/2016/5/10/chartex" xmlns:cx5="http://schemas.microsoft.com/office/drawing/2016/5/11/chartex" xmlns:cx6="http://schemas.microsoft.com/office/drawing/2016/5/12/chartex" xmlns:cx7="http://schemas.microsoft.com/office/drawing/2016/5/13/chartex" xmlns:cx8="http://schemas.microsoft.com/office/drawing/2016/5/14/chartex" xmlns:mc="http://schemas.openxmlformats.org/markup-compatibility/2006" xmlns:aink="http://schemas.microsoft.com/office/drawing/2016/ink" xmlns:am3d="http://schemas.microsoft.com/office/drawing/2017/model3d" xmlns:o="urn:schemas-microsoft-com:office:office" xmlns:oel="http://schemas.microsoft.com/office/2019/extlst" xmlns:r="http://schemas.openxmlformats.org/officeDocument/2006/relationships" xmlns:m="http://schemas.openxmlformats.org/officeDocument/2006/math" xmlns:v="urn:schemas-microsoft-com:vml" xmlns:wp14="http://schemas.microsoft.com/office/word/2010/wordprocessingDrawing" xmlns:wp="http://schemas.openxmlformats.org/drawingml/2006/wordprocessingDrawing" xmlns:w10="urn:schemas-microsoft-com:office:word" xmlns:w="http://schemas.openxmlformats.org/wordprocessingml/2006/main" xmlns:w14="http://schemas.microsoft.com/office/word/2010/wordml" xmlns:w15="http://schemas.microsoft.com/office/word/2012/wordml" xmlns:w16cex="http://schemas.microsoft.com/office/word/2018/wordml/cex" xmlns:w16cid="http://schemas.microsoft.com/office/word/2016/wordml/cid" xmlns:w16="http://schemas.microsoft.com/office/word/2018/wordml" xmlns:w16du="http://schemas.microsoft.com/office/word/2023/wordml/word16du" xmlns:w16sdtdh="http://schemas.microsoft.com/office/word/2020/wordml/sdtdatahash" xmlns:w16sdtfl="http://schemas.microsoft.com/office/word/2024/wordml/sdtformatlock" xmlns:w16se="http://schemas.microsoft.com/office/word/2015/wordml/symex" xmlns:wpg="http://schemas.microsoft.com/office/word/2010/wordprocessingGroup" xmlns:wpi="http://schemas.microsoft.com/office/word/2010/wordprocessingInk" xmlns:wne="http://schemas.microsoft.com/office/word/2006/wordml" xmlns:wps="http://schemas.microsoft.com/office/word/2010/wordprocessingShape" mc:Ignorable="w14 w15 w16se w16cid w16 w16cex w16sdtdh w16sdtfl w16du wp14">
   <w:body>
     <w:p>
-      <w:r>
+      <w:pPr>
+        <w:rPr>
+          <w:b/>
+          <w:bCs/>
+        </w:rPr>
+      </w:pPr>
+      <w:r>
+        <w:rPr>
+          <w:b/>
+          <w:bCs/>
+        </w:rPr>
         <w:t xml:space="preserve">LA PRESENTACIÓN (5:00 – 10:00)</w:t>
       </w:r>
     </w:p>
@@ -13,7 +23,7 @@
           <w:i/>
           <w:iCs/>
         </w:rPr>
-        <w:t xml:space="preserve">Diapositivas del PDF "Final MAD Open Data Challenge 2026" (0 a 6). La portada (0) está en pantalla antes de empezar la historia. Aquí empieza justo cuando acaba la historia de Laura y Carmen.</w:t>
+        <w:t xml:space="preserve">Aquí se acaba el rol play: Laura y Carmen salen del personaje y hablan ellas. Diapositivas del PDF "Final MAD Open Data Challenge 2026" (0 a 6; la portada ya estaba puesta al empezar).</w:t>
       </w:r>
     </w:p>
     <w:p/>
@@ -29,7 +39,7 @@
           <w:b/>
           <w:bCs/>
         </w:rPr>
-        <w:t xml:space="preserve">5:00 – 5:50 · El problema es de toda la Comunidad (diapositiva 1 · Laura)</w:t>
+        <w:t xml:space="preserve">5:00 – 5:20 · Bienvenida (nosotras, ya sin personaje)</w:t>
       </w:r>
     </w:p>
     <w:p>
@@ -49,22 +59,98 @@
         <w:t xml:space="preserve">: </w:t>
       </w:r>
       <w:r>
-        <w:t xml:space="preserve">Pasar a la diapositiva 1, Problema (se deja el navegador para luego)</w:t>
-      </w:r>
-    </w:p>
-    <w:p>
-      <w:r>
-        <w:rPr>
-          <w:b/>
-          <w:bCs/>
-        </w:rPr>
-        <w:t xml:space="preserve">Laura:</w:t>
+        <w:t xml:space="preserve">Cerrar el navegador y pasar a la diapositiva 1 (Problema)</w:t>
+      </w:r>
+    </w:p>
+    <w:p>
+      <w:r>
+        <w:rPr>
+          <w:b/>
+          <w:bCs/>
+        </w:rPr>
+        <w:t xml:space="preserve">Lucía:</w:t>
       </w:r>
       <w:r>
         <w:t xml:space="preserve"> "</w:t>
       </w:r>
       <w:r>
-        <w:t xml:space="preserve">Lo que habéis visto en Getafe no es un caso aislado. El planeamiento de la Comunidad prevé más de </w:t>
+        <w:rPr>
+          <w:b/>
+          <w:bCs/>
+        </w:rPr>
+        <w:t xml:space="preserve">Bienvenidos a Cuna y Canas.</w:t>
+      </w:r>
+      <w:r>
+        <w:t xml:space="preserve"> Hasta aquí, Laura y Carmen. Ahora somos nosotras: </w:t>
+      </w:r>
+      <w:r>
+        <w:rPr>
+          <w:b/>
+          <w:bCs/>
+        </w:rPr>
+        <w:t xml:space="preserve">Lucía…</w:t>
+      </w:r>
+      <w:r>
+        <w:t xml:space="preserve">"</w:t>
+      </w:r>
+    </w:p>
+    <w:p>
+      <w:r>
+        <w:rPr>
+          <w:b/>
+          <w:bCs/>
+        </w:rPr>
+        <w:t xml:space="preserve">Claudia:</w:t>
+      </w:r>
+      <w:r>
+        <w:t xml:space="preserve"> "</w:t>
+      </w:r>
+      <w:r>
+        <w:t xml:space="preserve">…y </w:t>
+      </w:r>
+      <w:r>
+        <w:rPr>
+          <w:b/>
+          <w:bCs/>
+        </w:rPr>
+        <w:t xml:space="preserve">Claudia Agromayor</w:t>
+      </w:r>
+      <w:r>
+        <w:t xml:space="preserve">. Y venimos a contaros qué hay detrás de lo que acabáis de ver: un problema de toda la Comunidad de Madrid, los datos abiertos con los que lo resolvemos, y por qué podéis fiaros de ellos.</w:t>
+      </w:r>
+      <w:r>
+        <w:t xml:space="preserve">"</w:t>
+      </w:r>
+    </w:p>
+    <w:p/>
+    <w:p>
+      <w:pPr>
+        <w:rPr>
+          <w:b/>
+          <w:bCs/>
+        </w:rPr>
+      </w:pPr>
+      <w:r>
+        <w:rPr>
+          <w:b/>
+          <w:bCs/>
+        </w:rPr>
+        <w:t xml:space="preserve">5:20 – 6:00 · El problema es de toda la Comunidad (diapositiva 1 · Lucía)</w:t>
+      </w:r>
+    </w:p>
+    <w:p>
+      <w:r>
+        <w:rPr>
+          <w:b/>
+          <w:bCs/>
+        </w:rPr>
+        <w:t xml:space="preserve">Lucía:</w:t>
+      </w:r>
+      <w:r>
+        <w:t xml:space="preserve"> "</w:t>
+      </w:r>
+      <w:r>
+        <w:t xml:space="preserve">Lo de Getafe no es un caso aislado. El planeamiento prevé más de </w:t>
       </w:r>
       <w:r>
         <w:rPr>
@@ -74,7 +160,7 @@
         <w:t xml:space="preserve">513.000 viviendas en 144 municipios</w:t>
       </w:r>
       <w:r>
-        <w:t xml:space="preserve">. Pero ojo: según el catastro, unas </w:t>
+        <w:t xml:space="preserve">. Según el catastro, unas </w:t>
       </w:r>
       <w:r>
         <w:rPr>
@@ -84,7 +170,37 @@
         <w:t xml:space="preserve">222.000 aún no están construidas</w:t>
       </w:r>
       <w:r>
-        <w:t xml:space="preserve">. Esas son las que vienen.</w:t>
+        <w:t xml:space="preserve">: esas son las que vienen. Con ellas, entre </w:t>
+      </w:r>
+      <w:r>
+        <w:rPr>
+          <w:b/>
+          <w:bCs/>
+        </w:rPr>
+        <w:t xml:space="preserve">medio millón y 700.000 personas</w:t>
+      </w:r>
+      <w:r>
+        <w:t xml:space="preserve">, y harían falta entre </w:t>
+      </w:r>
+      <w:r>
+        <w:rPr>
+          <w:b/>
+          <w:bCs/>
+        </w:rPr>
+        <w:t xml:space="preserve">38.000 y 93.000 plazas de colegio</w:t>
+      </w:r>
+      <w:r>
+        <w:t xml:space="preserve"> y el equivalente a </w:t>
+      </w:r>
+      <w:r>
+        <w:rPr>
+          <w:b/>
+          <w:bCs/>
+        </w:rPr>
+        <w:t xml:space="preserve">19–27 centros de salud</w:t>
+      </w:r>
+      <w:r>
+        <w:t xml:space="preserve">.</w:t>
       </w:r>
       <w:r>
         <w:t xml:space="preserve">"</w:t>
@@ -96,86 +212,38 @@
           <w:b/>
           <w:bCs/>
         </w:rPr>
-        <w:t xml:space="preserve">Laura:</w:t>
+        <w:t xml:space="preserve">Lucía:</w:t>
       </w:r>
       <w:r>
         <w:t xml:space="preserve"> "</w:t>
       </w:r>
       <w:r>
-        <w:t xml:space="preserve">Con ellas, entre </w:t>
-      </w:r>
-      <w:r>
-        <w:rPr>
-          <w:b/>
-          <w:bCs/>
-        </w:rPr>
-        <w:t xml:space="preserve">medio millón y 700.000 personas</w:t>
-      </w:r>
-      <w:r>
-        <w:t xml:space="preserve">. Harían falta entre </w:t>
-      </w:r>
-      <w:r>
-        <w:rPr>
-          <w:b/>
-          <w:bCs/>
-        </w:rPr>
-        <w:t xml:space="preserve">38.000 y 93.000 plazas de colegio</w:t>
-      </w:r>
-      <w:r>
-        <w:t xml:space="preserve"> y el equivalente a entre </w:t>
-      </w:r>
-      <w:r>
-        <w:rPr>
-          <w:b/>
-          <w:bCs/>
-        </w:rPr>
-        <w:t xml:space="preserve">19 y 27 centros de salud</w:t>
-      </w:r>
-      <w:r>
-        <w:t xml:space="preserve">.</w:t>
+        <w:t xml:space="preserve">Y ya pasa: en </w:t>
+      </w:r>
+      <w:r>
+        <w:rPr>
+          <w:b/>
+          <w:bCs/>
+        </w:rPr>
+        <w:t xml:space="preserve">Los Molinos</w:t>
+      </w:r>
+      <w:r>
+        <w:t xml:space="preserve">, el </w:t>
+      </w:r>
+      <w:r>
+        <w:rPr>
+          <w:b/>
+          <w:bCs/>
+        </w:rPr>
+        <w:t xml:space="preserve">72 % del suelo reservado para equipamientos sigue vacío</w:t>
+      </w:r>
+      <w:r>
+        <w:t xml:space="preserve"> mientras viven 11.473 personas sin centro de salud cerca. Hay suelo; falta decidir dónde y cuándo.</w:t>
       </w:r>
       <w:r>
         <w:t xml:space="preserve">"</w:t>
       </w:r>
     </w:p>
-    <w:p>
-      <w:r>
-        <w:rPr>
-          <w:b/>
-          <w:bCs/>
-        </w:rPr>
-        <w:t xml:space="preserve">Laura:</w:t>
-      </w:r>
-      <w:r>
-        <w:t xml:space="preserve"> "</w:t>
-      </w:r>
-      <w:r>
-        <w:t xml:space="preserve">Y esto ya pasa. </w:t>
-      </w:r>
-      <w:r>
-        <w:rPr>
-          <w:b/>
-          <w:bCs/>
-        </w:rPr>
-        <w:t xml:space="preserve">Los Molinos</w:t>
-      </w:r>
-      <w:r>
-        <w:t xml:space="preserve">: 11.473 vecinos, ni centro de salud ni escuela infantil pública a menos de diez minutos andando… y el </w:t>
-      </w:r>
-      <w:r>
-        <w:rPr>
-          <w:b/>
-          <w:bCs/>
-        </w:rPr>
-        <w:t xml:space="preserve">72 % del suelo reservado para equipamientos sigue vacío</w:t>
-      </w:r>
-      <w:r>
-        <w:t xml:space="preserve">. Hay suelo; lo que falta es decidir dónde y cuándo, antes de que lleguen.</w:t>
-      </w:r>
-      <w:r>
-        <w:t xml:space="preserve">"</w:t>
-      </w:r>
-    </w:p>
     <w:p/>
     <w:p>
       <w:pPr>
@@ -189,7 +257,7 @@
           <w:b/>
           <w:bCs/>
         </w:rPr>
-        <w:t xml:space="preserve">5:50 – 6:40 · Qué es Cuna y Canas (diapositiva 2 · Carmen)</w:t>
+        <w:t xml:space="preserve">6:00 – 6:40 · Qué es Cuna y Canas (diapositiva 2 · Claudia)</w:t>
       </w:r>
     </w:p>
     <w:p>
@@ -218,13 +286,13 @@
           <w:b/>
           <w:bCs/>
         </w:rPr>
-        <w:t xml:space="preserve">Carmen:</w:t>
+        <w:t xml:space="preserve">Claudia:</w:t>
       </w:r>
       <w:r>
         <w:t xml:space="preserve"> "</w:t>
       </w:r>
       <w:r>
-        <w:t xml:space="preserve">Lo que habéis visto cabe en una frase: las herramientas actuales te dicen dónde vivir hoy. </w:t>
+        <w:t xml:space="preserve">Las herramientas actuales te dicen dónde vivir hoy. </w:t>
       </w:r>
       <w:r>
         <w:rPr>
@@ -234,57 +302,42 @@
         <w:t xml:space="preserve">Cuna y Canas te dice qué va a faltar mañana, y dónde ponerlo.</w:t>
       </w:r>
       <w:r>
+        <w:t xml:space="preserve"> Son tres pantallas con los mismos datos: </w:t>
+      </w:r>
+      <w:r>
+        <w:rPr>
+          <w:b/>
+          <w:bCs/>
+        </w:rPr>
+        <w:t xml:space="preserve">¿Dónde vivir?</w:t>
+      </w:r>
+      <w:r>
+        <w:t xml:space="preserve"> ordena los 179 municipios según tu vida; </w:t>
+      </w:r>
+      <w:r>
+        <w:rPr>
+          <w:b/>
+          <w:bCs/>
+        </w:rPr>
+        <w:t xml:space="preserve">Barrios</w:t>
+      </w:r>
+      <w:r>
+        <w:t xml:space="preserve"> enseña qué tienes a 5, 10 o 20 minutos andando y qué viene; y </w:t>
+      </w:r>
+      <w:r>
+        <w:rPr>
+          <w:b/>
+          <w:bCs/>
+        </w:rPr>
+        <w:t xml:space="preserve">Planificar</w:t>
+      </w:r>
+      <w:r>
+        <w:t xml:space="preserve">, la que usaba Carmen, dice cuántos centros, cuándo y dónde.</w:t>
+      </w:r>
+      <w:r>
         <w:t xml:space="preserve">"</w:t>
       </w:r>
     </w:p>
-    <w:p>
-      <w:r>
-        <w:rPr>
-          <w:b/>
-          <w:bCs/>
-        </w:rPr>
-        <w:t xml:space="preserve">Carmen:</w:t>
-      </w:r>
-      <w:r>
-        <w:t xml:space="preserve"> "</w:t>
-      </w:r>
-      <w:r>
-        <w:t xml:space="preserve">Son tres pantallas con los mismos datos. </w:t>
-      </w:r>
-      <w:r>
-        <w:rPr>
-          <w:b/>
-          <w:bCs/>
-        </w:rPr>
-        <w:t xml:space="preserve">¿Dónde vivir?</w:t>
-      </w:r>
-      <w:r>
-        <w:t xml:space="preserve"> ordena los 179 municipios según tu vida. </w:t>
-      </w:r>
-      <w:r>
-        <w:rPr>
-          <w:b/>
-          <w:bCs/>
-        </w:rPr>
-        <w:t xml:space="preserve">Barrios</w:t>
-      </w:r>
-      <w:r>
-        <w:t xml:space="preserve"> te enseña qué tienes a 5, 10 o 20 minutos andando, y qué viene. Y </w:t>
-      </w:r>
-      <w:r>
-        <w:rPr>
-          <w:b/>
-          <w:bCs/>
-        </w:rPr>
-        <w:t xml:space="preserve">Planificar</w:t>
-      </w:r>
-      <w:r>
-        <w:t xml:space="preserve">, la mía: cuántos centros, cuándo y dónde.</w:t>
-      </w:r>
-      <w:r>
-        <w:t xml:space="preserve">"</w:t>
-      </w:r>
-    </w:p>
     <w:p/>
     <w:p>
       <w:pPr>
@@ -298,7 +351,7 @@
           <w:b/>
           <w:bCs/>
         </w:rPr>
-        <w:t xml:space="preserve">6:40 – 7:30 · De dónde salen los datos (diapositiva 3 · Laura)</w:t>
+        <w:t xml:space="preserve">6:40 – 7:25 · De dónde salen los datos (diapositiva 3 · Lucía)</w:t>
       </w:r>
     </w:p>
     <w:p>
@@ -327,7 +380,7 @@
           <w:b/>
           <w:bCs/>
         </w:rPr>
-        <w:t xml:space="preserve">Laura:</w:t>
+        <w:t xml:space="preserve">Lucía:</w:t>
       </w:r>
       <w:r>
         <w:t xml:space="preserve"> "</w:t>
@@ -343,7 +396,17 @@
         <w:t xml:space="preserve">datos abiertos consultados por API</w:t>
       </w:r>
       <w:r>
-        <w:t xml:space="preserve">: el portal y el IDEM de la Comunidad de Madrid, el Atlas de Renta del INE y el Consorcio de Transportes.</w:t>
+        <w:t xml:space="preserve">: el portal y el IDEM de la Comunidad de Madrid, el Atlas de Renta del INE y el Consorcio de Transportes. La tabla dice también </w:t>
+      </w:r>
+      <w:r>
+        <w:rPr>
+          <w:b/>
+          <w:bCs/>
+        </w:rPr>
+        <w:t xml:space="preserve">para qué no se usa cada fuente</w:t>
+      </w:r>
+      <w:r>
+        <w:t xml:space="preserve">: sin licitaciones, sin saber quién es el dueño de cada parcela, sin tiempos de viaje reales. Preferimos decirlo a inventarlo.</w:t>
       </w:r>
       <w:r>
         <w:t xml:space="preserve">"</w:t>
@@ -355,35 +418,7 @@
           <w:b/>
           <w:bCs/>
         </w:rPr>
-        <w:t xml:space="preserve">Laura:</w:t>
-      </w:r>
-      <w:r>
-        <w:t xml:space="preserve"> "</w:t>
-      </w:r>
-      <w:r>
-        <w:t xml:space="preserve">Y la tabla dice también </w:t>
-      </w:r>
-      <w:r>
-        <w:rPr>
-          <w:b/>
-          <w:bCs/>
-        </w:rPr>
-        <w:t xml:space="preserve">para qué no se usa cada fuente</w:t>
-      </w:r>
-      <w:r>
-        <w:t xml:space="preserve">: sin licitaciones, sin saber quién es el dueño de cada parcela, sin tiempos de viaje reales. Preferimos decirlo a inventarlo.</w:t>
-      </w:r>
-      <w:r>
-        <w:t xml:space="preserve">"</w:t>
-      </w:r>
-    </w:p>
-    <w:p>
-      <w:r>
-        <w:rPr>
-          <w:b/>
-          <w:bCs/>
-        </w:rPr>
-        <w:t xml:space="preserve">Laura:</w:t>
+        <w:t xml:space="preserve">Lucía:</w:t>
       </w:r>
       <w:r>
         <w:t xml:space="preserve"> "</w:t>
@@ -448,7 +483,7 @@
           <w:b/>
           <w:bCs/>
         </w:rPr>
-        <w:t xml:space="preserve">7:30 – 8:50 · Cómo se calcula y por qué fiarse (diapositiva 4 · Carmen)</w:t>
+        <w:t xml:space="preserve">7:25 – 8:40 · Cómo se calcula y por qué fiarse (diapositiva 4 · Claudia)</w:t>
       </w:r>
     </w:p>
     <w:p>
@@ -477,7 +512,7 @@
           <w:b/>
           <w:bCs/>
         </w:rPr>
-        <w:t xml:space="preserve">Carmen:</w:t>
+        <w:t xml:space="preserve">Claudia:</w:t>
       </w:r>
       <w:r>
         <w:t xml:space="preserve"> "</w:t>
@@ -505,7 +540,7 @@
           <w:b/>
           <w:bCs/>
         </w:rPr>
-        <w:t xml:space="preserve">Carmen:</w:t>
+        <w:t xml:space="preserve">Claudia:</w:t>
       </w:r>
       <w:r>
         <w:t xml:space="preserve"> "</w:t>
@@ -528,7 +563,17 @@
         <w:t xml:space="preserve">28 barrios ya habitados de 17 municipios</w:t>
       </w:r>
       <w:r>
-        <w:t xml:space="preserve">.</w:t>
+        <w:t xml:space="preserve">. ¿Acierta? Lo probamos con el pasado: dejamos fuera el municipio entero, predecimos su población sin mirar sus datos y la comparamos con el padrón real. </w:t>
+      </w:r>
+      <w:r>
+        <w:rPr>
+          <w:b/>
+          <w:bCs/>
+        </w:rPr>
+        <w:t xml:space="preserve">Error medio del 13 %; la regla habitual falla un 25 %.</w:t>
+      </w:r>
+      <w:r>
+        <w:t xml:space="preserve"> Y el rango que damos acierta el 79 % de las veces. Probamos más variables y ninguna mejoraba de forma fiable: preferimos un modelo que se pueda explicar.</w:t>
       </w:r>
       <w:r>
         <w:t xml:space="preserve">"</w:t>
@@ -540,91 +585,45 @@
           <w:b/>
           <w:bCs/>
         </w:rPr>
-        <w:t xml:space="preserve">Carmen:</w:t>
+        <w:t xml:space="preserve">Claudia:</w:t>
       </w:r>
       <w:r>
         <w:t xml:space="preserve"> "</w:t>
       </w:r>
       <w:r>
-        <w:t xml:space="preserve">¿Acierta? Lo probamos con el pasado: dejamos fuera el municipio entero, predecimos su población sin mirar sus datos y la comparamos con el padrón real. </w:t>
-      </w:r>
-      <w:r>
-        <w:rPr>
-          <w:b/>
-          <w:bCs/>
-        </w:rPr>
-        <w:t xml:space="preserve">Error medio del 13 %; la regla habitual falla un 25 %.</w:t>
-      </w:r>
-      <w:r>
-        <w:t xml:space="preserve"> Y el rango que damos acierta el 79 % de las veces.</w:t>
+        <w:rPr>
+          <w:b/>
+          <w:bCs/>
+        </w:rPr>
+        <w:t xml:space="preserve">Segundo, elegir la parcela.</w:t>
+      </w:r>
+      <w:r>
+        <w:t xml:space="preserve"> Candidatas: parcelas vacías de equipamiento. Elige la que cubre más demanda sin pasar de su capacidad, y repite. Y siempre enseña </w:t>
+      </w:r>
+      <w:r>
+        <w:rPr>
+          <w:b/>
+          <w:bCs/>
+        </w:rPr>
+        <w:t xml:space="preserve">tres alternativas descartadas</w:t>
+      </w:r>
+      <w:r>
+        <w:t xml:space="preserve"> y si la propuesta </w:t>
+      </w:r>
+      <w:r>
+        <w:rPr>
+          <w:b/>
+          <w:bCs/>
+        </w:rPr>
+        <w:t xml:space="preserve">aguanta</w:t>
+      </w:r>
+      <w:r>
+        <w:t xml:space="preserve"> con menos viviendas y tres años de retraso.</w:t>
       </w:r>
       <w:r>
         <w:t xml:space="preserve">"</w:t>
       </w:r>
     </w:p>
-    <w:p>
-      <w:r>
-        <w:rPr>
-          <w:b/>
-          <w:bCs/>
-        </w:rPr>
-        <w:t xml:space="preserve">Carmen:</w:t>
-      </w:r>
-      <w:r>
-        <w:t xml:space="preserve"> "</w:t>
-      </w:r>
-      <w:r>
-        <w:t xml:space="preserve">Probamos más variables, y ninguna mejoraba de forma fiable: preferimos un modelo que se pueda explicar.</w:t>
-      </w:r>
-      <w:r>
-        <w:t xml:space="preserve">"</w:t>
-      </w:r>
-    </w:p>
-    <w:p>
-      <w:r>
-        <w:rPr>
-          <w:b/>
-          <w:bCs/>
-        </w:rPr>
-        <w:t xml:space="preserve">Carmen:</w:t>
-      </w:r>
-      <w:r>
-        <w:t xml:space="preserve"> "</w:t>
-      </w:r>
-      <w:r>
-        <w:rPr>
-          <w:b/>
-          <w:bCs/>
-        </w:rPr>
-        <w:t xml:space="preserve">Segundo, elegir la parcela.</w:t>
-      </w:r>
-      <w:r>
-        <w:t xml:space="preserve"> Candidatas: parcelas vacías de equipamiento. Elige la que cubre más demanda sin pasar de su capacidad, y repite. Y siempre enseña </w:t>
-      </w:r>
-      <w:r>
-        <w:rPr>
-          <w:b/>
-          <w:bCs/>
-        </w:rPr>
-        <w:t xml:space="preserve">tres alternativas descartadas</w:t>
-      </w:r>
-      <w:r>
-        <w:t xml:space="preserve"> y si la propuesta </w:t>
-      </w:r>
-      <w:r>
-        <w:rPr>
-          <w:b/>
-          <w:bCs/>
-        </w:rPr>
-        <w:t xml:space="preserve">aguanta</w:t>
-      </w:r>
-      <w:r>
-        <w:t xml:space="preserve"> con menos viviendas y tres años de retraso.</w:t>
-      </w:r>
-      <w:r>
-        <w:t xml:space="preserve">"</w:t>
-      </w:r>
-    </w:p>
     <w:p/>
     <w:p>
       <w:pPr>
@@ -638,7 +637,7 @@
           <w:b/>
           <w:bCs/>
         </w:rPr>
-        <w:t xml:space="preserve">8:50 – 9:30 · Limitaciones y próximos pasos (diapositiva 5 · Laura)</w:t>
+        <w:t xml:space="preserve">8:40 – 9:20 · Limitaciones y próximos pasos (diapositiva 5 · Lucía)</w:t>
       </w:r>
     </w:p>
     <w:p>
@@ -667,7 +666,7 @@
           <w:b/>
           <w:bCs/>
         </w:rPr>
-        <w:t xml:space="preserve">Laura:</w:t>
+        <w:t xml:space="preserve">Lucía:</w:t>
       </w:r>
       <w:r>
         <w:t xml:space="preserve"> "</w:t>
@@ -712,7 +711,7 @@
           <w:b/>
           <w:bCs/>
         </w:rPr>
-        <w:t xml:space="preserve">Laura:</w:t>
+        <w:t xml:space="preserve">Lucía:</w:t>
       </w:r>
       <w:r>
         <w:t xml:space="preserve"> "</w:t>
@@ -738,40 +737,22 @@
         <w:t xml:space="preserve">tiempos por calles</w:t>
       </w:r>
       <w:r>
-        <w:t xml:space="preserve">, validar con ayuntamientos y un acceso real con Cl@ve.</w:t>
+        <w:t xml:space="preserve">; validar con ayuntamientos; y un acceso real con Cl@ve. Y hoy ya funciona: está </w:t>
+      </w:r>
+      <w:r>
+        <w:rPr>
+          <w:b/>
+          <w:bCs/>
+        </w:rPr>
+        <w:t xml:space="preserve">publicado en Oracle Cloud</w:t>
+      </w:r>
+      <w:r>
+        <w:t xml:space="preserve">, vale para cualquier municipio y con un comando se actualiza con los datos nuevos. Cuesta cero: datos abiertos y software libre.</w:t>
       </w:r>
       <w:r>
         <w:t xml:space="preserve">"</w:t>
       </w:r>
     </w:p>
-    <w:p>
-      <w:r>
-        <w:rPr>
-          <w:b/>
-          <w:bCs/>
-        </w:rPr>
-        <w:t xml:space="preserve">Laura:</w:t>
-      </w:r>
-      <w:r>
-        <w:t xml:space="preserve"> "</w:t>
-      </w:r>
-      <w:r>
-        <w:t xml:space="preserve">Y hoy ya funciona: está </w:t>
-      </w:r>
-      <w:r>
-        <w:rPr>
-          <w:b/>
-          <w:bCs/>
-        </w:rPr>
-        <w:t xml:space="preserve">publicado en Oracle Cloud</w:t>
-      </w:r>
-      <w:r>
-        <w:t xml:space="preserve">, vale para cualquier municipio y con un comando se actualiza con los datos nuevos. Cuesta cero: datos abiertos y software libre.</w:t>
-      </w:r>
-      <w:r>
-        <w:t xml:space="preserve">"</w:t>
-      </w:r>
-    </w:p>
     <w:p/>
     <w:p>
       <w:pPr>
@@ -785,7 +766,7 @@
           <w:b/>
           <w:bCs/>
         </w:rPr>
-        <w:t xml:space="preserve">9:30 – 10:00 · Cierre (diapositiva 6 · las dos)</w:t>
+        <w:t xml:space="preserve">9:20 – 10:00 · Cierre (diapositiva 6 · las dos)</w:t>
       </w:r>
     </w:p>
     <w:p>
@@ -814,7 +795,7 @@
           <w:b/>
           <w:bCs/>
         </w:rPr>
-        <w:t xml:space="preserve">Laura:</w:t>
+        <w:t xml:space="preserve">Lucía:</w:t>
       </w:r>
       <w:r>
         <w:t xml:space="preserve"> "</w:t>
@@ -830,6 +811,9 @@
         <w:t xml:space="preserve">Cuna y Canas te dice qué va a faltar mañana, y dónde ponerlo.</w:t>
       </w:r>
       <w:r>
+        <w:t xml:space="preserve"> De la cuna…</w:t>
+      </w:r>
+      <w:r>
         <w:t xml:space="preserve">"</w:t>
       </w:r>
     </w:p>
@@ -839,25 +823,7 @@
           <w:b/>
           <w:bCs/>
         </w:rPr>
-        <w:t xml:space="preserve">Laura:</w:t>
-      </w:r>
-      <w:r>
-        <w:t xml:space="preserve"> "</w:t>
-      </w:r>
-      <w:r>
-        <w:t xml:space="preserve">De la cuna…</w:t>
-      </w:r>
-      <w:r>
-        <w:t xml:space="preserve">"</w:t>
-      </w:r>
-    </w:p>
-    <w:p>
-      <w:r>
-        <w:rPr>
-          <w:b/>
-          <w:bCs/>
-        </w:rPr>
-        <w:t xml:space="preserve">Carmen:</w:t>
+        <w:t xml:space="preserve">Claudia:</w:t>
       </w:r>
       <w:r>
         <w:t xml:space="preserve"> "</w:t>
@@ -992,7 +958,7 @@
     </w:p>
     <w:p>
       <w:r>
-        <w:t xml:space="preserve">Las diapositivas 3, 4 y 5 ya coinciden con lo que dice este texto (179 / 178 / 144, error 13,1 % frente a 25,1 %, 79 %, 28 barrios de 17 municipios).</w:t>
+        <w:t xml:space="preserve">Las diapositivas 3, 4 y 5 ya coinciden con lo que dice este texto (179 / 144, error 13,1 % frente a 25,1 %, 79 %, 28 barrios de 17 municipios).</w:t>
       </w:r>
     </w:p>
     <w:sectPr>

</xml_diff>